<commit_message>
docs: expand CONCEPT_00_PART3 with perplexity guide and eval metrics
</commit_message>
<xml_diff>
--- a/documentation/CONCEPT_00_PART3_SFT_TRAINING_OBJECTIVE.docx
+++ b/documentation/CONCEPT_00_PART3_SFT_TRAINING_OBJECTIVE.docx
@@ -3524,7 +3524,7 @@
                 <w:sz w:val="26"/>
                 <w:szCs w:val="26"/>
               </w:rPr>
-              <w:t xml:space="preserve">Evaluating the Adapter</w:t>
+              <w:t xml:space="preserve">Evaluating the Adapter — Metrics, Perplexity, and How to Know it Worked</w:t>
             </w:r>
           </w:p>
         </w:tc>
@@ -3536,6 +3536,14 @@
       </w:pPr>
       <w:r>
         <w:t xml:space="preserve"/>
+      </w:r>
+    </w:p>
+    <w:p>
+      <w:pPr>
+        <w:pStyle w:val="Heading2"/>
+      </w:pPr>
+      <w:r>
+        <w:t xml:space="preserve">8a. How inference runs WITHOUT merging the adapter</w:t>
       </w:r>
     </w:p>
     <w:p>
@@ -3549,23 +3557,21 @@
           <w:sz w:val="22"/>
           <w:szCs w:val="22"/>
         </w:rPr>
-        <w:t xml:space="preserve">How do we know if the fine-tuning worked? Three approaches:</w:t>
-      </w:r>
-    </w:p>
-    <w:p>
-      <w:pPr>
-        <w:spacing w:after="100"/>
-      </w:pPr>
-      <w:r>
-        <w:t xml:space="preserve"/>
-      </w:r>
-    </w:p>
-    <w:p>
-      <w:pPr>
-        <w:pStyle w:val="Heading2"/>
-      </w:pPr>
-      <w:r>
-        <w:t xml:space="preserve">1. Training loss curve</w:t>
+        <w:t xml:space="preserve">A common question: "don't you need to update the weights before running inference?" The answer is no — and this is one of LoRA's core design advantages.</w:t>
+      </w:r>
+    </w:p>
+    <w:p>
+      <w:pPr>
+        <w:spacing w:before="0" w:after="160"/>
+      </w:pPr>
+      <w:r>
+        <w:rPr>
+          <w:rFonts w:ascii="Arial" w:cs="Arial" w:eastAsia="Arial" w:hAnsi="Arial"/>
+          <w:color w:val="1A202C"/>
+          <w:sz w:val="22"/>
+          <w:szCs w:val="22"/>
+        </w:rPr>
+        <w:t xml:space="preserve">When PEFT loads a LoRA adapter via PeftModel.from_pretrained(), it wraps the base model and modifies the forward pass dynamically. For every adapted layer, during inference:</w:t>
       </w:r>
     </w:p>
     <w:tbl>
@@ -3612,7 +3618,49 @@
                 <w:sz w:val="18"/>
                 <w:szCs w:val="18"/>
               </w:rPr>
-              <w:t xml:space="preserve">Loss should decrease smoothly from ~2.5 (random) to ~0.8-1.2 (well-trained).</w:t>
+              <w:t xml:space="preserve"># What happens inside each attention/MLP layer during inference:</w:t>
+            </w:r>
+          </w:p>
+          <w:p>
+            <w:pPr>
+              <w:spacing w:line="260"/>
+            </w:pPr>
+            <w:r>
+              <w:rPr>
+                <w:rFonts w:ascii="Courier New" w:cs="Courier New" w:eastAsia="Courier New" w:hAnsi="Courier New"/>
+                <w:color w:val="2D3748"/>
+                <w:sz w:val="18"/>
+                <w:szCs w:val="18"/>
+              </w:rPr>
+              <w:t xml:space="preserve">base_output = W_base @ input          # W_base is frozen, loaded in 4-bit NF4</w:t>
+            </w:r>
+          </w:p>
+          <w:p>
+            <w:pPr>
+              <w:spacing w:line="260"/>
+            </w:pPr>
+            <w:r>
+              <w:rPr>
+                <w:rFonts w:ascii="Courier New" w:cs="Courier New" w:eastAsia="Courier New" w:hAnsi="Courier New"/>
+                <w:color w:val="2D3748"/>
+                <w:sz w:val="18"/>
+                <w:szCs w:val="18"/>
+              </w:rPr>
+              <w:t xml:space="preserve">lora_delta  = (alpha/r) * (B @ A) @ input  # A, B from adapter_model.safetensors</w:t>
+            </w:r>
+          </w:p>
+          <w:p>
+            <w:pPr>
+              <w:spacing w:line="260"/>
+            </w:pPr>
+            <w:r>
+              <w:rPr>
+                <w:rFonts w:ascii="Courier New" w:cs="Courier New" w:eastAsia="Courier New" w:hAnsi="Courier New"/>
+                <w:color w:val="2D3748"/>
+                <w:sz w:val="18"/>
+                <w:szCs w:val="18"/>
+              </w:rPr>
+              <w:t xml:space="preserve">final_output = base_output + lora_delta     # Applied on-the-fly every forward pass</w:t>
             </w:r>
           </w:p>
           <w:p>
@@ -3640,63 +3688,21 @@
                 <w:sz w:val="18"/>
                 <w:szCs w:val="18"/>
               </w:rPr>
-              <w:t xml:space="preserve">If it decreases too fast and plateaus near 0:</w:t>
-            </w:r>
-          </w:p>
-          <w:p>
-            <w:pPr>
-              <w:spacing w:line="260"/>
-            </w:pPr>
-            <w:r>
-              <w:rPr>
-                <w:rFonts w:ascii="Courier New" w:cs="Courier New" w:eastAsia="Courier New" w:hAnsi="Courier New"/>
-                <w:color w:val="2D3748"/>
-                <w:sz w:val="18"/>
-                <w:szCs w:val="18"/>
-              </w:rPr>
-              <w:t xml:space="preserve">  → Overfitting (too many epochs, too small dataset)</w:t>
-            </w:r>
-          </w:p>
-          <w:p>
-            <w:pPr>
-              <w:spacing w:line="260"/>
-            </w:pPr>
-            <w:r>
-              <w:rPr>
-                <w:rFonts w:ascii="Courier New" w:cs="Courier New" w:eastAsia="Courier New" w:hAnsi="Courier New"/>
-                <w:color w:val="2D3748"/>
-                <w:sz w:val="18"/>
-                <w:szCs w:val="18"/>
-              </w:rPr>
-              <w:t xml:space="preserve"/>
-            </w:r>
-          </w:p>
-          <w:p>
-            <w:pPr>
-              <w:spacing w:line="260"/>
-            </w:pPr>
-            <w:r>
-              <w:rPr>
-                <w:rFonts w:ascii="Courier New" w:cs="Courier New" w:eastAsia="Courier New" w:hAnsi="Courier New"/>
-                <w:color w:val="2D3748"/>
-                <w:sz w:val="18"/>
-                <w:szCs w:val="18"/>
-              </w:rPr>
-              <w:t xml:space="preserve">If it does not decrease:</w:t>
-            </w:r>
-          </w:p>
-          <w:p>
-            <w:pPr>
-              <w:spacing w:line="260"/>
-            </w:pPr>
-            <w:r>
-              <w:rPr>
-                <w:rFonts w:ascii="Courier New" w:cs="Courier New" w:eastAsia="Courier New" w:hAnsi="Courier New"/>
-                <w:color w:val="2D3748"/>
-                <w:sz w:val="18"/>
-                <w:szCs w:val="18"/>
-              </w:rPr>
-              <w:t xml:space="preserve">  → Learning rate too low, wrong data format, or configuration error</w:t>
+              <w:t xml:space="preserve"># The base model weights on disk are never modified.</w:t>
+            </w:r>
+          </w:p>
+          <w:p>
+            <w:pPr>
+              <w:spacing w:line="260"/>
+            </w:pPr>
+            <w:r>
+              <w:rPr>
+                <w:rFonts w:ascii="Courier New" w:cs="Courier New" w:eastAsia="Courier New" w:hAnsi="Courier New"/>
+                <w:color w:val="2D3748"/>
+                <w:sz w:val="18"/>
+                <w:szCs w:val="18"/>
+              </w:rPr>
+              <w:t xml:space="preserve"># The adapter matrices are added as an offset at runtime.</w:t>
             </w:r>
           </w:p>
         </w:tc>
@@ -3710,17 +3716,131 @@
         <w:t xml:space="preserve"/>
       </w:r>
     </w:p>
+    <w:tbl>
+      <w:tblPr>
+        <w:tblW w:type="dxa" w:w="9360"/>
+        <w:tblBorders>
+          <w:top w:val="single" w:color="auto" w:sz="4"/>
+          <w:left w:val="single" w:color="auto" w:sz="4"/>
+          <w:bottom w:val="single" w:color="auto" w:sz="4"/>
+          <w:right w:val="single" w:color="auto" w:sz="4"/>
+          <w:insideH w:val="single" w:color="auto" w:sz="4"/>
+          <w:insideV w:val="single" w:color="auto" w:sz="4"/>
+        </w:tblBorders>
+      </w:tblPr>
+      <w:tblGrid>
+        <w:gridCol w:w="9360"/>
+      </w:tblGrid>
+      <w:tr>
+        <w:tc>
+          <w:tcPr>
+            <w:tcW w:type="dxa" w:w="9360"/>
+            <w:tcBorders>
+              <w:top w:val="single" w:color="2B6CB0" w:sz="4"/>
+              <w:left w:val="single" w:color="2B6CB0" w:sz="14"/>
+              <w:bottom w:val="single" w:color="2B6CB0" w:sz="4"/>
+              <w:right w:val="single" w:color="2B6CB0" w:sz="4"/>
+            </w:tcBorders>
+            <w:shd w:fill="EBF8FF" w:val="clear"/>
+            <w:tcMar>
+              <w:top w:type="dxa" w:w="120"/>
+              <w:left w:type="dxa" w:w="200"/>
+              <w:bottom w:type="dxa" w:w="120"/>
+              <w:right w:type="dxa" w:w="200"/>
+            </w:tcMar>
+          </w:tcPr>
+          <w:p>
+            <w:pPr>
+              <w:spacing w:after="60"/>
+            </w:pPr>
+            <w:r>
+              <w:rPr>
+                <w:rFonts w:ascii="Arial" w:cs="Arial" w:eastAsia="Arial" w:hAnsi="Arial"/>
+                <w:color w:val="1A365D"/>
+                <w:sz w:val="20"/>
+                <w:szCs w:val="20"/>
+              </w:rPr>
+              <w:t xml:space="preserve">This is why eval.py in Activity 0 could measure the fine-tuned model's perplexity</w:t>
+            </w:r>
+          </w:p>
+          <w:p>
+            <w:pPr>
+              <w:spacing w:after="60"/>
+            </w:pPr>
+            <w:r>
+              <w:rPr>
+                <w:rFonts w:ascii="Arial" w:cs="Arial" w:eastAsia="Arial" w:hAnsi="Arial"/>
+                <w:color w:val="1A365D"/>
+                <w:sz w:val="20"/>
+                <w:szCs w:val="20"/>
+              </w:rPr>
+              <w:t xml:space="preserve">and run qualitative comparisons without any merge step.</w:t>
+            </w:r>
+          </w:p>
+          <w:p>
+            <w:pPr>
+              <w:spacing w:after="60"/>
+            </w:pPr>
+            <w:r>
+              <w:rPr>
+                <w:rFonts w:ascii="Arial" w:cs="Arial" w:eastAsia="Arial" w:hAnsi="Arial"/>
+                <w:color w:val="1A365D"/>
+                <w:sz w:val="20"/>
+                <w:szCs w:val="20"/>
+              </w:rPr>
+              <w:t xml:space="preserve"/>
+            </w:r>
+          </w:p>
+          <w:p>
+            <w:pPr>
+              <w:spacing w:after="60"/>
+            </w:pPr>
+            <w:r>
+              <w:rPr>
+                <w:rFonts w:ascii="Arial" w:cs="Arial" w:eastAsia="Arial" w:hAnsi="Arial"/>
+                <w:color w:val="1A365D"/>
+                <w:sz w:val="20"/>
+                <w:szCs w:val="20"/>
+              </w:rPr>
+              <w:t xml:space="preserve">The tradeoff: unmerged inference is slightly slower (two matrix multiplications per layer</w:t>
+            </w:r>
+          </w:p>
+          <w:p>
+            <w:pPr>
+              <w:spacing w:after="60"/>
+            </w:pPr>
+            <w:r>
+              <w:rPr>
+                <w:rFonts w:ascii="Arial" w:cs="Arial" w:eastAsia="Arial" w:hAnsi="Arial"/>
+                <w:color w:val="1A365D"/>
+                <w:sz w:val="20"/>
+                <w:szCs w:val="20"/>
+              </w:rPr>
+              <w:t xml:space="preserve">instead of one). Activity 1 merges the weights precisely to eliminate this overhead.</w:t>
+            </w:r>
+          </w:p>
+        </w:tc>
+      </w:tr>
+    </w:tbl>
+    <w:p>
+      <w:pPr>
+        <w:spacing w:after="100"/>
+      </w:pPr>
+      <w:r>
+        <w:t xml:space="preserve"/>
+      </w:r>
+    </w:p>
     <w:p>
       <w:pPr>
         <w:pStyle w:val="Heading2"/>
       </w:pPr>
       <w:r>
-        <w:t xml:space="preserve">2. Manual evaluation (qualitative)</w:t>
-      </w:r>
-    </w:p>
-    <w:p>
-      <w:pPr>
-        <w:spacing w:before="0" w:after="160"/>
+        <w:t xml:space="preserve">8b. What perplexity actually measures</w:t>
+      </w:r>
+    </w:p>
+    <w:p>
+      <w:pPr>
+        <w:spacing w:before="0" w:after="120"/>
       </w:pPr>
       <w:r>
         <w:rPr>
@@ -3729,94 +3849,7 @@
           <w:sz w:val="22"/>
           <w:szCs w:val="22"/>
         </w:rPr>
-        <w:t xml:space="preserve">Ask the model cybersecurity-specific questions before and after fine-tuning:</w:t>
-      </w:r>
-    </w:p>
-    <w:p>
-      <w:pPr>
-        <w:pStyle w:val="ListParagraph"/>
-        <w:numPr>
-          <w:ilvl w:val="0"/>
-          <w:numId w:val="2"/>
-        </w:numPr>
-        <w:spacing w:after="100"/>
-      </w:pPr>
-      <w:r>
-        <w:rPr>
-          <w:rFonts w:ascii="Arial" w:cs="Arial" w:eastAsia="Arial" w:hAnsi="Arial"/>
-          <w:color w:val="1A202C"/>
-          <w:sz w:val="22"/>
-          <w:szCs w:val="22"/>
-        </w:rPr>
-        <w:t xml:space="preserve">"Explain CVE-2021-44228 (Log4Shell) and its attack vector"</w:t>
-      </w:r>
-    </w:p>
-    <w:p>
-      <w:pPr>
-        <w:pStyle w:val="ListParagraph"/>
-        <w:numPr>
-          <w:ilvl w:val="0"/>
-          <w:numId w:val="2"/>
-        </w:numPr>
-        <w:spacing w:after="100"/>
-      </w:pPr>
-      <w:r>
-        <w:rPr>
-          <w:rFonts w:ascii="Arial" w:cs="Arial" w:eastAsia="Arial" w:hAnsi="Arial"/>
-          <w:color w:val="1A202C"/>
-          <w:sz w:val="22"/>
-          <w:szCs w:val="22"/>
-        </w:rPr>
-        <w:t xml:space="preserve">"What is the difference between MITRE ATT&amp;CK T1059 and T1078?"</w:t>
-      </w:r>
-    </w:p>
-    <w:p>
-      <w:pPr>
-        <w:pStyle w:val="ListParagraph"/>
-        <w:numPr>
-          <w:ilvl w:val="0"/>
-          <w:numId w:val="2"/>
-        </w:numPr>
-        <w:spacing w:after="100"/>
-      </w:pPr>
-      <w:r>
-        <w:rPr>
-          <w:rFonts w:ascii="Arial" w:cs="Arial" w:eastAsia="Arial" w:hAnsi="Arial"/>
-          <w:color w:val="1A202C"/>
-          <w:sz w:val="22"/>
-          <w:szCs w:val="22"/>
-        </w:rPr>
-        <w:t xml:space="preserve">"A user reports their credentials were compromised. What initial response steps do you recommend?"</w:t>
-      </w:r>
-    </w:p>
-    <w:p>
-      <w:pPr>
-        <w:spacing w:after="100"/>
-      </w:pPr>
-      <w:r>
-        <w:t xml:space="preserve"/>
-      </w:r>
-    </w:p>
-    <w:p>
-      <w:pPr>
-        <w:pStyle w:val="Heading2"/>
-      </w:pPr>
-      <w:r>
-        <w:t xml:space="preserve">3. Perplexity on a held-out cybersecurity test set</w:t>
-      </w:r>
-    </w:p>
-    <w:p>
-      <w:pPr>
-        <w:spacing w:before="0" w:after="160"/>
-      </w:pPr>
-      <w:r>
-        <w:rPr>
-          <w:rFonts w:ascii="Arial" w:cs="Arial" w:eastAsia="Arial" w:hAnsi="Arial"/>
-          <w:color w:val="1A202C"/>
-          <w:sz w:val="22"/>
-          <w:szCs w:val="22"/>
-        </w:rPr>
-        <w:t xml:space="preserve">Take 5% of the Trendyol dataset as a test split. Compute perplexity:</w:t>
+        <w:t xml:space="preserve">Perplexity is the single most important number from the eval run. It is defined as:</w:t>
       </w:r>
     </w:p>
     <w:tbl>
@@ -3863,7 +3896,7 @@
                 <w:sz w:val="18"/>
                 <w:szCs w:val="18"/>
               </w:rPr>
-              <w:t xml:space="preserve">perplexity = exp(average cross-entropy loss)  on the test set</w:t>
+              <w:t xml:space="preserve">perplexity = exp(average cross-entropy loss on the test set)</w:t>
             </w:r>
           </w:p>
           <w:p>
@@ -3891,7 +3924,35 @@
                 <w:sz w:val="18"/>
                 <w:szCs w:val="18"/>
               </w:rPr>
-              <w:t xml:space="preserve">Lower perplexity = model assigns higher probability to the correct tokens</w:t>
+              <w:t xml:space="preserve"># The cross-entropy loss at each token position asks:</w:t>
+            </w:r>
+          </w:p>
+          <w:p>
+            <w:pPr>
+              <w:spacing w:line="260"/>
+            </w:pPr>
+            <w:r>
+              <w:rPr>
+                <w:rFonts w:ascii="Courier New" w:cs="Courier New" w:eastAsia="Courier New" w:hAnsi="Courier New"/>
+                <w:color w:val="2D3748"/>
+                <w:sz w:val="18"/>
+                <w:szCs w:val="18"/>
+              </w:rPr>
+              <w:t xml:space="preserve"># "Given everything before this token, how much probability did the model</w:t>
+            </w:r>
+          </w:p>
+          <w:p>
+            <w:pPr>
+              <w:spacing w:line="260"/>
+            </w:pPr>
+            <w:r>
+              <w:rPr>
+                <w:rFonts w:ascii="Courier New" w:cs="Courier New" w:eastAsia="Courier New" w:hAnsi="Courier New"/>
+                <w:color w:val="2D3748"/>
+                <w:sz w:val="18"/>
+                <w:szCs w:val="18"/>
+              </w:rPr>
+              <w:t xml:space="preserve">#  assign to the CORRECT next token?"</w:t>
             </w:r>
           </w:p>
           <w:p>
@@ -3919,21 +3980,21 @@
                 <w:sz w:val="18"/>
                 <w:szCs w:val="18"/>
               </w:rPr>
-              <w:t xml:space="preserve">Compare: base model perplexity vs fine-tuned model perplexity</w:t>
-            </w:r>
-          </w:p>
-          <w:p>
-            <w:pPr>
-              <w:spacing w:line="260"/>
-            </w:pPr>
-            <w:r>
-              <w:rPr>
-                <w:rFonts w:ascii="Courier New" w:cs="Courier New" w:eastAsia="Courier New" w:hAnsi="Courier New"/>
-                <w:color w:val="2D3748"/>
-                <w:sz w:val="18"/>
-                <w:szCs w:val="18"/>
-              </w:rPr>
-              <w:t xml:space="preserve">Expected: 20-40% perplexity reduction on domain data</w:t>
+              <w:t xml:space="preserve"># If the model was very confident and correct: loss near 0</w:t>
+            </w:r>
+          </w:p>
+          <w:p>
+            <w:pPr>
+              <w:spacing w:line="260"/>
+            </w:pPr>
+            <w:r>
+              <w:rPr>
+                <w:rFonts w:ascii="Courier New" w:cs="Courier New" w:eastAsia="Courier New" w:hAnsi="Courier New"/>
+                <w:color w:val="2D3748"/>
+                <w:sz w:val="18"/>
+                <w:szCs w:val="18"/>
+              </w:rPr>
+              <w:t xml:space="preserve"># If the model was surprised (wrong or uncertain): loss is high</w:t>
             </w:r>
           </w:p>
           <w:p>
@@ -3961,21 +4022,1379 @@
                 <w:sz w:val="18"/>
                 <w:szCs w:val="18"/>
               </w:rPr>
-              <w:t xml:space="preserve">Base model on cybersecurity QA:  perplexity ≈ 15-25</w:t>
-            </w:r>
-          </w:p>
-          <w:p>
-            <w:pPr>
-              <w:spacing w:line="260"/>
-            </w:pPr>
-            <w:r>
-              <w:rPr>
-                <w:rFonts w:ascii="Courier New" w:cs="Courier New" w:eastAsia="Courier New" w:hAnsi="Courier New"/>
-                <w:color w:val="2D3748"/>
-                <w:sz w:val="18"/>
-                <w:szCs w:val="18"/>
-              </w:rPr>
-              <w:t xml:space="preserve">Fine-tuned model:                perplexity ≈ 8-15</w:t>
+              <w:t xml:space="preserve"># Perplexity = "how many equally-likely choices did the model feel it had</w:t>
+            </w:r>
+          </w:p>
+          <w:p>
+            <w:pPr>
+              <w:spacing w:line="260"/>
+            </w:pPr>
+            <w:r>
+              <w:rPr>
+                <w:rFonts w:ascii="Courier New" w:cs="Courier New" w:eastAsia="Courier New" w:hAnsi="Courier New"/>
+                <w:color w:val="2D3748"/>
+                <w:sz w:val="18"/>
+                <w:szCs w:val="18"/>
+              </w:rPr>
+              <w:t xml:space="preserve">#               at each step, on average?"</w:t>
+            </w:r>
+          </w:p>
+          <w:p>
+            <w:pPr>
+              <w:spacing w:line="260"/>
+            </w:pPr>
+            <w:r>
+              <w:rPr>
+                <w:rFonts w:ascii="Courier New" w:cs="Courier New" w:eastAsia="Courier New" w:hAnsi="Courier New"/>
+                <w:color w:val="2D3748"/>
+                <w:sz w:val="18"/>
+                <w:szCs w:val="18"/>
+              </w:rPr>
+              <w:t xml:space="preserve"/>
+            </w:r>
+          </w:p>
+          <w:p>
+            <w:pPr>
+              <w:spacing w:line="260"/>
+            </w:pPr>
+            <w:r>
+              <w:rPr>
+                <w:rFonts w:ascii="Courier New" w:cs="Courier New" w:eastAsia="Courier New" w:hAnsi="Courier New"/>
+                <w:color w:val="2D3748"/>
+                <w:sz w:val="18"/>
+                <w:szCs w:val="18"/>
+              </w:rPr>
+              <w:t xml:space="preserve">perplexity of 5.22  → model felt ~5 reasonable candidates per step</w:t>
+            </w:r>
+          </w:p>
+          <w:p>
+            <w:pPr>
+              <w:spacing w:line="260"/>
+            </w:pPr>
+            <w:r>
+              <w:rPr>
+                <w:rFonts w:ascii="Courier New" w:cs="Courier New" w:eastAsia="Courier New" w:hAnsi="Courier New"/>
+                <w:color w:val="2D3748"/>
+                <w:sz w:val="18"/>
+                <w:szCs w:val="18"/>
+              </w:rPr>
+              <w:t xml:space="preserve">perplexity of 2.04  → model felt ~2 reasonable candidates per step</w:t>
+            </w:r>
+          </w:p>
+          <w:p>
+            <w:pPr>
+              <w:spacing w:line="260"/>
+            </w:pPr>
+            <w:r>
+              <w:rPr>
+                <w:rFonts w:ascii="Courier New" w:cs="Courier New" w:eastAsia="Courier New" w:hAnsi="Courier New"/>
+                <w:color w:val="2D3748"/>
+                <w:sz w:val="18"/>
+                <w:szCs w:val="18"/>
+              </w:rPr>
+              <w:t xml:space="preserve"/>
+            </w:r>
+          </w:p>
+          <w:p>
+            <w:pPr>
+              <w:spacing w:line="260"/>
+            </w:pPr>
+            <w:r>
+              <w:rPr>
+                <w:rFonts w:ascii="Courier New" w:cs="Courier New" w:eastAsia="Courier New" w:hAnsi="Courier New"/>
+                <w:color w:val="2D3748"/>
+                <w:sz w:val="18"/>
+                <w:szCs w:val="18"/>
+              </w:rPr>
+              <w:t xml:space="preserve"># The relationship to eval_loss (what you see in training logs):</w:t>
+            </w:r>
+          </w:p>
+          <w:p>
+            <w:pPr>
+              <w:spacing w:line="260"/>
+            </w:pPr>
+            <w:r>
+              <w:rPr>
+                <w:rFonts w:ascii="Courier New" w:cs="Courier New" w:eastAsia="Courier New" w:hAnsi="Courier New"/>
+                <w:color w:val="2D3748"/>
+                <w:sz w:val="18"/>
+                <w:szCs w:val="18"/>
+              </w:rPr>
+              <w:t xml:space="preserve">eval_loss = 0.7126</w:t>
+            </w:r>
+          </w:p>
+          <w:p>
+            <w:pPr>
+              <w:spacing w:line="260"/>
+            </w:pPr>
+            <w:r>
+              <w:rPr>
+                <w:rFonts w:ascii="Courier New" w:cs="Courier New" w:eastAsia="Courier New" w:hAnsi="Courier New"/>
+                <w:color w:val="2D3748"/>
+                <w:sz w:val="18"/>
+                <w:szCs w:val="18"/>
+              </w:rPr>
+              <w:t xml:space="preserve">perplexity = exp(0.7126) = 2.04    # They are the same number, different scale</w:t>
+            </w:r>
+          </w:p>
+        </w:tc>
+      </w:tr>
+    </w:tbl>
+    <w:p>
+      <w:pPr>
+        <w:spacing w:after="100"/>
+      </w:pPr>
+      <w:r>
+        <w:t xml:space="preserve"/>
+      </w:r>
+    </w:p>
+    <w:p>
+      <w:pPr>
+        <w:spacing w:before="0" w:after="160"/>
+      </w:pPr>
+      <w:r>
+        <w:rPr>
+          <w:rFonts w:ascii="Arial" w:cs="Arial" w:eastAsia="Arial" w:hAnsi="Arial"/>
+          <w:color w:val="1A202C"/>
+          <w:sz w:val="22"/>
+          <w:szCs w:val="22"/>
+        </w:rPr>
+        <w:t xml:space="preserve">An important nuance: perplexity is computed only on the assistant response tokens (masked loss, same as training). The model is not being tested on how well it predicts system prompts or user questions — only on how well it predicts the correct cybersecurity answer given the question context.</w:t>
+      </w:r>
+    </w:p>
+    <w:p>
+      <w:pPr>
+        <w:spacing w:after="100"/>
+      </w:pPr>
+      <w:r>
+        <w:t xml:space="preserve"/>
+      </w:r>
+    </w:p>
+    <w:p>
+      <w:pPr>
+        <w:pStyle w:val="Heading2"/>
+      </w:pPr>
+      <w:r>
+        <w:t xml:space="preserve">8c. Activity 0 actual results (what we observed)</w:t>
+      </w:r>
+    </w:p>
+    <w:tbl>
+      <w:tblPr>
+        <w:tblW w:type="dxa" w:w="9360"/>
+        <w:tblBorders>
+          <w:top w:val="single" w:color="auto" w:sz="4"/>
+          <w:left w:val="single" w:color="auto" w:sz="4"/>
+          <w:bottom w:val="single" w:color="auto" w:sz="4"/>
+          <w:right w:val="single" w:color="auto" w:sz="4"/>
+          <w:insideH w:val="single" w:color="auto" w:sz="4"/>
+          <w:insideV w:val="single" w:color="auto" w:sz="4"/>
+        </w:tblBorders>
+      </w:tblPr>
+      <w:tblGrid>
+        <w:gridCol w:w="9360"/>
+      </w:tblGrid>
+      <w:tr>
+        <w:tc>
+          <w:tcPr>
+            <w:tcW w:type="dxa" w:w="9360"/>
+            <w:tcBorders>
+              <w:top w:val="single" w:color="CCCCCC" w:sz="1"/>
+              <w:left w:val="single" w:color="CCCCCC" w:sz="1"/>
+              <w:bottom w:val="single" w:color="CCCCCC" w:sz="1"/>
+              <w:right w:val="single" w:color="CCCCCC" w:sz="1"/>
+            </w:tcBorders>
+            <w:shd w:fill="F0F4F8" w:val="clear"/>
+            <w:tcMar>
+              <w:top w:type="dxa" w:w="120"/>
+              <w:left w:type="dxa" w:w="200"/>
+              <w:bottom w:type="dxa" w:w="120"/>
+              <w:right w:type="dxa" w:w="200"/>
+            </w:tcMar>
+          </w:tcPr>
+          <w:p>
+            <w:pPr>
+              <w:spacing w:line="260"/>
+            </w:pPr>
+            <w:r>
+              <w:rPr>
+                <w:rFonts w:ascii="Courier New" w:cs="Courier New" w:eastAsia="Courier New" w:hAnsi="Courier New"/>
+                <w:color w:val="2D3748"/>
+                <w:sz w:val="18"/>
+                <w:szCs w:val="18"/>
+              </w:rPr>
+              <w:t xml:space="preserve">DRY RUN (before any training — LoRA initialized but B matrices all zeros):</w:t>
+            </w:r>
+          </w:p>
+          <w:p>
+            <w:pPr>
+              <w:spacing w:line="260"/>
+            </w:pPr>
+            <w:r>
+              <w:rPr>
+                <w:rFonts w:ascii="Courier New" w:cs="Courier New" w:eastAsia="Courier New" w:hAnsi="Courier New"/>
+                <w:color w:val="2D3748"/>
+                <w:sz w:val="18"/>
+                <w:szCs w:val="18"/>
+              </w:rPr>
+              <w:t xml:space="preserve">  eval_loss = 1.6527</w:t>
+            </w:r>
+          </w:p>
+          <w:p>
+            <w:pPr>
+              <w:spacing w:line="260"/>
+            </w:pPr>
+            <w:r>
+              <w:rPr>
+                <w:rFonts w:ascii="Courier New" w:cs="Courier New" w:eastAsia="Courier New" w:hAnsi="Courier New"/>
+                <w:color w:val="2D3748"/>
+                <w:sz w:val="18"/>
+                <w:szCs w:val="18"/>
+              </w:rPr>
+              <w:t xml:space="preserve">  perplexity = exp(1.6527) = 5.22</w:t>
+            </w:r>
+          </w:p>
+          <w:p>
+            <w:pPr>
+              <w:spacing w:line="260"/>
+            </w:pPr>
+            <w:r>
+              <w:rPr>
+                <w:rFonts w:ascii="Courier New" w:cs="Courier New" w:eastAsia="Courier New" w:hAnsi="Courier New"/>
+                <w:color w:val="2D3748"/>
+                <w:sz w:val="18"/>
+                <w:szCs w:val="18"/>
+              </w:rPr>
+              <w:t xml:space="preserve">  Interpretation: effectively the base Llama model on cybersec text.</w:t>
+            </w:r>
+          </w:p>
+          <w:p>
+            <w:pPr>
+              <w:spacing w:line="260"/>
+            </w:pPr>
+            <w:r>
+              <w:rPr>
+                <w:rFonts w:ascii="Courier New" w:cs="Courier New" w:eastAsia="Courier New" w:hAnsi="Courier New"/>
+                <w:color w:val="2D3748"/>
+                <w:sz w:val="18"/>
+                <w:szCs w:val="18"/>
+              </w:rPr>
+              <w:t xml:space="preserve">  Model has ~5 equally-likely guesses per token — it does not know this domain well.</w:t>
+            </w:r>
+          </w:p>
+          <w:p>
+            <w:pPr>
+              <w:spacing w:line="260"/>
+            </w:pPr>
+            <w:r>
+              <w:rPr>
+                <w:rFonts w:ascii="Courier New" w:cs="Courier New" w:eastAsia="Courier New" w:hAnsi="Courier New"/>
+                <w:color w:val="2D3748"/>
+                <w:sz w:val="18"/>
+                <w:szCs w:val="18"/>
+              </w:rPr>
+              <w:t xml:space="preserve"/>
+            </w:r>
+          </w:p>
+          <w:p>
+            <w:pPr>
+              <w:spacing w:line="260"/>
+            </w:pPr>
+            <w:r>
+              <w:rPr>
+                <w:rFonts w:ascii="Courier New" w:cs="Courier New" w:eastAsia="Courier New" w:hAnsi="Courier New"/>
+                <w:color w:val="2D3748"/>
+                <w:sz w:val="18"/>
+                <w:szCs w:val="18"/>
+              </w:rPr>
+              <w:t xml:space="preserve">AFTER 3 EPOCHS of QLoRA fine-tuning (3,492 steps):</w:t>
+            </w:r>
+          </w:p>
+          <w:p>
+            <w:pPr>
+              <w:spacing w:line="260"/>
+            </w:pPr>
+            <w:r>
+              <w:rPr>
+                <w:rFonts w:ascii="Courier New" w:cs="Courier New" w:eastAsia="Courier New" w:hAnsi="Courier New"/>
+                <w:color w:val="2D3748"/>
+                <w:sz w:val="18"/>
+                <w:szCs w:val="18"/>
+              </w:rPr>
+              <w:t xml:space="preserve">  eval_loss = 0.7126</w:t>
+            </w:r>
+          </w:p>
+          <w:p>
+            <w:pPr>
+              <w:spacing w:line="260"/>
+            </w:pPr>
+            <w:r>
+              <w:rPr>
+                <w:rFonts w:ascii="Courier New" w:cs="Courier New" w:eastAsia="Courier New" w:hAnsi="Courier New"/>
+                <w:color w:val="2D3748"/>
+                <w:sz w:val="18"/>
+                <w:szCs w:val="18"/>
+              </w:rPr>
+              <w:t xml:space="preserve">  perplexity = exp(0.7126) = 2.04</w:t>
+            </w:r>
+          </w:p>
+          <w:p>
+            <w:pPr>
+              <w:spacing w:line="260"/>
+            </w:pPr>
+            <w:r>
+              <w:rPr>
+                <w:rFonts w:ascii="Courier New" w:cs="Courier New" w:eastAsia="Courier New" w:hAnsi="Courier New"/>
+                <w:color w:val="2D3748"/>
+                <w:sz w:val="18"/>
+                <w:szCs w:val="18"/>
+              </w:rPr>
+              <w:t xml:space="preserve">  Improvement: 5.22 → 2.04 = 2.56x reduction in perplexity (61% improvement)</w:t>
+            </w:r>
+          </w:p>
+          <w:p>
+            <w:pPr>
+              <w:spacing w:line="260"/>
+            </w:pPr>
+            <w:r>
+              <w:rPr>
+                <w:rFonts w:ascii="Courier New" w:cs="Courier New" w:eastAsia="Courier New" w:hAnsi="Courier New"/>
+                <w:color w:val="2D3748"/>
+                <w:sz w:val="18"/>
+                <w:szCs w:val="18"/>
+              </w:rPr>
+              <w:t xml:space="preserve">  Model has ~2 equally-likely guesses per step — much more confident on domain text.</w:t>
+            </w:r>
+          </w:p>
+          <w:p>
+            <w:pPr>
+              <w:spacing w:line="260"/>
+            </w:pPr>
+            <w:r>
+              <w:rPr>
+                <w:rFonts w:ascii="Courier New" w:cs="Courier New" w:eastAsia="Courier New" w:hAnsi="Courier New"/>
+                <w:color w:val="2D3748"/>
+                <w:sz w:val="18"/>
+                <w:szCs w:val="18"/>
+              </w:rPr>
+              <w:t xml:space="preserve"/>
+            </w:r>
+          </w:p>
+          <w:p>
+            <w:pPr>
+              <w:spacing w:line="260"/>
+            </w:pPr>
+            <w:r>
+              <w:rPr>
+                <w:rFonts w:ascii="Courier New" w:cs="Courier New" w:eastAsia="Courier New" w:hAnsi="Courier New"/>
+                <w:color w:val="2D3748"/>
+                <w:sz w:val="18"/>
+                <w:szCs w:val="18"/>
+              </w:rPr>
+              <w:t xml:space="preserve">LOSS TRAJECTORY (key checkpoints):</w:t>
+            </w:r>
+          </w:p>
+          <w:p>
+            <w:pPr>
+              <w:spacing w:line="260"/>
+            </w:pPr>
+            <w:r>
+              <w:rPr>
+                <w:rFonts w:ascii="Courier New" w:cs="Courier New" w:eastAsia="Courier New" w:hAnsi="Courier New"/>
+                <w:color w:val="2D3748"/>
+                <w:sz w:val="18"/>
+                <w:szCs w:val="18"/>
+              </w:rPr>
+              <w:t xml:space="preserve">  Step   10  (epoch 0.01): train_loss = 2.12  [CUDA warmup complete]</w:t>
+            </w:r>
+          </w:p>
+          <w:p>
+            <w:pPr>
+              <w:spacing w:line="260"/>
+            </w:pPr>
+            <w:r>
+              <w:rPr>
+                <w:rFonts w:ascii="Courier New" w:cs="Courier New" w:eastAsia="Courier New" w:hAnsi="Courier New"/>
+                <w:color w:val="2D3748"/>
+                <w:sz w:val="18"/>
+                <w:szCs w:val="18"/>
+              </w:rPr>
+              <w:t xml:space="preserve">  Step   60  (epoch 0.05): train_loss = 1.19  [rapid initial learning]</w:t>
+            </w:r>
+          </w:p>
+          <w:p>
+            <w:pPr>
+              <w:spacing w:line="260"/>
+            </w:pPr>
+            <w:r>
+              <w:rPr>
+                <w:rFonts w:ascii="Courier New" w:cs="Courier New" w:eastAsia="Courier New" w:hAnsi="Courier New"/>
+                <w:color w:val="2D3748"/>
+                <w:sz w:val="18"/>
+                <w:szCs w:val="18"/>
+              </w:rPr>
+              <w:t xml:space="preserve">  Step  440  (epoch 0.37): train_loss = 0.86  [refinement begins]</w:t>
+            </w:r>
+          </w:p>
+          <w:p>
+            <w:pPr>
+              <w:spacing w:line="260"/>
+            </w:pPr>
+            <w:r>
+              <w:rPr>
+                <w:rFonts w:ascii="Courier New" w:cs="Courier New" w:eastAsia="Courier New" w:hAnsi="Courier New"/>
+                <w:color w:val="2D3748"/>
+                <w:sz w:val="18"/>
+                <w:szCs w:val="18"/>
+              </w:rPr>
+              <w:t xml:space="preserve">  Step 1500  (epoch 1.28): train_loss = 0.70, eval_loss = 0.74  [end epoch 1]</w:t>
+            </w:r>
+          </w:p>
+          <w:p>
+            <w:pPr>
+              <w:spacing w:line="260"/>
+            </w:pPr>
+            <w:r>
+              <w:rPr>
+                <w:rFonts w:ascii="Courier New" w:cs="Courier New" w:eastAsia="Courier New" w:hAnsi="Courier New"/>
+                <w:color w:val="2D3748"/>
+                <w:sz w:val="18"/>
+                <w:szCs w:val="18"/>
+              </w:rPr>
+              <w:t xml:space="preserve">  Step 3492  (epoch 3.00): train_loss = 0.58, eval_loss = 0.71  [training complete]</w:t>
+            </w:r>
+          </w:p>
+        </w:tc>
+      </w:tr>
+    </w:tbl>
+    <w:p>
+      <w:pPr>
+        <w:spacing w:after="100"/>
+      </w:pPr>
+      <w:r>
+        <w:t xml:space="preserve"/>
+      </w:r>
+    </w:p>
+    <w:p>
+      <w:pPr>
+        <w:pStyle w:val="Heading2"/>
+      </w:pPr>
+      <w:r>
+        <w:t xml:space="preserve">8d. Reading the train/eval gap — diagnosing overfitting</w:t>
+      </w:r>
+    </w:p>
+    <w:p>
+      <w:pPr>
+        <w:spacing w:before="0" w:after="160"/>
+      </w:pPr>
+      <w:r>
+        <w:rPr>
+          <w:rFonts w:ascii="Arial" w:cs="Arial" w:eastAsia="Arial" w:hAnsi="Arial"/>
+          <w:color w:val="1A202C"/>
+          <w:sz w:val="22"/>
+          <w:szCs w:val="22"/>
+        </w:rPr>
+        <w:t xml:space="preserve">Overfitting means the model has memorised training examples rather than learning generalizable patterns. The diagnostic signal is the </w:t>
+      </w:r>
+      <w:r>
+        <w:rPr>
+          <w:rFonts w:ascii="Arial" w:cs="Arial" w:eastAsia="Arial" w:hAnsi="Arial"/>
+          <w:b/>
+          <w:bCs/>
+          <w:color w:val="1A202C"/>
+          <w:sz w:val="22"/>
+          <w:szCs w:val="22"/>
+        </w:rPr>
+        <w:t xml:space="preserve">gap between training loss and eval loss</w:t>
+      </w:r>
+      <w:r>
+        <w:rPr>
+          <w:rFonts w:ascii="Arial" w:cs="Arial" w:eastAsia="Arial" w:hAnsi="Arial"/>
+          <w:color w:val="1A202C"/>
+          <w:sz w:val="22"/>
+          <w:szCs w:val="22"/>
+        </w:rPr>
+        <w:t xml:space="preserve">.</w:t>
+      </w:r>
+    </w:p>
+    <w:tbl>
+      <w:tblPr>
+        <w:tblW w:type="dxa" w:w="9360"/>
+        <w:tblBorders>
+          <w:top w:val="single" w:color="auto" w:sz="4"/>
+          <w:left w:val="single" w:color="auto" w:sz="4"/>
+          <w:bottom w:val="single" w:color="auto" w:sz="4"/>
+          <w:right w:val="single" w:color="auto" w:sz="4"/>
+          <w:insideH w:val="single" w:color="auto" w:sz="4"/>
+          <w:insideV w:val="single" w:color="auto" w:sz="4"/>
+        </w:tblBorders>
+      </w:tblPr>
+      <w:tblGrid>
+        <w:gridCol w:w="9360"/>
+      </w:tblGrid>
+      <w:tr>
+        <w:tc>
+          <w:tcPr>
+            <w:tcW w:type="dxa" w:w="9360"/>
+            <w:tcBorders>
+              <w:top w:val="single" w:color="CCCCCC" w:sz="1"/>
+              <w:left w:val="single" w:color="CCCCCC" w:sz="1"/>
+              <w:bottom w:val="single" w:color="CCCCCC" w:sz="1"/>
+              <w:right w:val="single" w:color="CCCCCC" w:sz="1"/>
+            </w:tcBorders>
+            <w:shd w:fill="F0F4F8" w:val="clear"/>
+            <w:tcMar>
+              <w:top w:type="dxa" w:w="120"/>
+              <w:left w:type="dxa" w:w="200"/>
+              <w:bottom w:type="dxa" w:w="120"/>
+              <w:right w:type="dxa" w:w="200"/>
+            </w:tcMar>
+          </w:tcPr>
+          <w:p>
+            <w:pPr>
+              <w:spacing w:line="260"/>
+            </w:pPr>
+            <w:r>
+              <w:rPr>
+                <w:rFonts w:ascii="Courier New" w:cs="Courier New" w:eastAsia="Courier New" w:hAnsi="Courier New"/>
+                <w:color w:val="2D3748"/>
+                <w:sz w:val="18"/>
+                <w:szCs w:val="18"/>
+              </w:rPr>
+              <w:t xml:space="preserve">OVERFITTING would look like:</w:t>
+            </w:r>
+          </w:p>
+          <w:p>
+            <w:pPr>
+              <w:spacing w:line="260"/>
+            </w:pPr>
+            <w:r>
+              <w:rPr>
+                <w:rFonts w:ascii="Courier New" w:cs="Courier New" w:eastAsia="Courier New" w:hAnsi="Courier New"/>
+                <w:color w:val="2D3748"/>
+                <w:sz w:val="18"/>
+                <w:szCs w:val="18"/>
+              </w:rPr>
+              <w:t xml:space="preserve">  Epoch 1: train_loss = 0.70, eval_loss = 0.74   gap = 0.04</w:t>
+            </w:r>
+          </w:p>
+          <w:p>
+            <w:pPr>
+              <w:spacing w:line="260"/>
+            </w:pPr>
+            <w:r>
+              <w:rPr>
+                <w:rFonts w:ascii="Courier New" w:cs="Courier New" w:eastAsia="Courier New" w:hAnsi="Courier New"/>
+                <w:color w:val="2D3748"/>
+                <w:sz w:val="18"/>
+                <w:szCs w:val="18"/>
+              </w:rPr>
+              <w:t xml:space="preserve">  Epoch 2: train_loss = 0.50, eval_loss = 0.82   gap = 0.32  &lt;- eval rising</w:t>
+            </w:r>
+          </w:p>
+          <w:p>
+            <w:pPr>
+              <w:spacing w:line="260"/>
+            </w:pPr>
+            <w:r>
+              <w:rPr>
+                <w:rFonts w:ascii="Courier New" w:cs="Courier New" w:eastAsia="Courier New" w:hAnsi="Courier New"/>
+                <w:color w:val="2D3748"/>
+                <w:sz w:val="18"/>
+                <w:szCs w:val="18"/>
+              </w:rPr>
+              <w:t xml:space="preserve">  Epoch 3: train_loss = 0.35, eval_loss = 1.10   gap = 0.75  &lt;- severe overfit</w:t>
+            </w:r>
+          </w:p>
+          <w:p>
+            <w:pPr>
+              <w:spacing w:line="260"/>
+            </w:pPr>
+            <w:r>
+              <w:rPr>
+                <w:rFonts w:ascii="Courier New" w:cs="Courier New" w:eastAsia="Courier New" w:hAnsi="Courier New"/>
+                <w:color w:val="2D3748"/>
+                <w:sz w:val="18"/>
+                <w:szCs w:val="18"/>
+              </w:rPr>
+              <w:t xml:space="preserve"/>
+            </w:r>
+          </w:p>
+          <w:p>
+            <w:pPr>
+              <w:spacing w:line="260"/>
+            </w:pPr>
+            <w:r>
+              <w:rPr>
+                <w:rFonts w:ascii="Courier New" w:cs="Courier New" w:eastAsia="Courier New" w:hAnsi="Courier New"/>
+                <w:color w:val="2D3748"/>
+                <w:sz w:val="18"/>
+                <w:szCs w:val="18"/>
+              </w:rPr>
+              <w:t xml:space="preserve">WHAT WE ACTUALLY SAW (no overfitting):</w:t>
+            </w:r>
+          </w:p>
+          <w:p>
+            <w:pPr>
+              <w:spacing w:line="260"/>
+            </w:pPr>
+            <w:r>
+              <w:rPr>
+                <w:rFonts w:ascii="Courier New" w:cs="Courier New" w:eastAsia="Courier New" w:hAnsi="Courier New"/>
+                <w:color w:val="2D3748"/>
+                <w:sz w:val="18"/>
+                <w:szCs w:val="18"/>
+              </w:rPr>
+              <w:t xml:space="preserve">  Epoch 1: train_loss = 0.70, eval_loss = 0.74   gap = 0.04</w:t>
+            </w:r>
+          </w:p>
+          <w:p>
+            <w:pPr>
+              <w:spacing w:line="260"/>
+            </w:pPr>
+            <w:r>
+              <w:rPr>
+                <w:rFonts w:ascii="Courier New" w:cs="Courier New" w:eastAsia="Courier New" w:hAnsi="Courier New"/>
+                <w:color w:val="2D3748"/>
+                <w:sz w:val="18"/>
+                <w:szCs w:val="18"/>
+              </w:rPr>
+              <w:t xml:space="preserve">  Epoch 3: train_loss = 0.72 (avg), eval_loss = 0.71   gap = 0.008  &lt;- gap NARROWED</w:t>
+            </w:r>
+          </w:p>
+          <w:p>
+            <w:pPr>
+              <w:spacing w:line="260"/>
+            </w:pPr>
+            <w:r>
+              <w:rPr>
+                <w:rFonts w:ascii="Courier New" w:cs="Courier New" w:eastAsia="Courier New" w:hAnsi="Courier New"/>
+                <w:color w:val="2D3748"/>
+                <w:sz w:val="18"/>
+                <w:szCs w:val="18"/>
+              </w:rPr>
+              <w:t xml:space="preserve"/>
+            </w:r>
+          </w:p>
+          <w:p>
+            <w:pPr>
+              <w:spacing w:line="260"/>
+            </w:pPr>
+            <w:r>
+              <w:rPr>
+                <w:rFonts w:ascii="Courier New" w:cs="Courier New" w:eastAsia="Courier New" w:hAnsi="Courier New"/>
+                <w:color w:val="2D3748"/>
+                <w:sz w:val="18"/>
+                <w:szCs w:val="18"/>
+              </w:rPr>
+              <w:t xml:space="preserve"># The gap narrowing from 0.04 to 0.008 is the opposite of overfitting.</w:t>
+            </w:r>
+          </w:p>
+          <w:p>
+            <w:pPr>
+              <w:spacing w:line="260"/>
+            </w:pPr>
+            <w:r>
+              <w:rPr>
+                <w:rFonts w:ascii="Courier New" w:cs="Courier New" w:eastAsia="Courier New" w:hAnsi="Courier New"/>
+                <w:color w:val="2D3748"/>
+                <w:sz w:val="18"/>
+                <w:szCs w:val="18"/>
+              </w:rPr>
+              <w:t xml:space="preserve"># The model generalised BETTER as training progressed.</w:t>
+            </w:r>
+          </w:p>
+          <w:p>
+            <w:pPr>
+              <w:spacing w:line="260"/>
+            </w:pPr>
+            <w:r>
+              <w:rPr>
+                <w:rFonts w:ascii="Courier New" w:cs="Courier New" w:eastAsia="Courier New" w:hAnsi="Courier New"/>
+                <w:color w:val="2D3748"/>
+                <w:sz w:val="18"/>
+                <w:szCs w:val="18"/>
+              </w:rPr>
+              <w:t xml:space="preserve"># This confirms 3 epochs was the right call for this dataset size.</w:t>
+            </w:r>
+          </w:p>
+        </w:tc>
+      </w:tr>
+    </w:tbl>
+    <w:p>
+      <w:pPr>
+        <w:spacing w:after="100"/>
+      </w:pPr>
+      <w:r>
+        <w:t xml:space="preserve"/>
+      </w:r>
+    </w:p>
+    <w:tbl>
+      <w:tblPr>
+        <w:tblW w:type="dxa" w:w="9360"/>
+        <w:tblBorders>
+          <w:top w:val="single" w:color="auto" w:sz="4"/>
+          <w:left w:val="single" w:color="auto" w:sz="4"/>
+          <w:bottom w:val="single" w:color="auto" w:sz="4"/>
+          <w:right w:val="single" w:color="auto" w:sz="4"/>
+          <w:insideH w:val="single" w:color="auto" w:sz="4"/>
+          <w:insideV w:val="single" w:color="auto" w:sz="4"/>
+        </w:tblBorders>
+      </w:tblPr>
+      <w:tblGrid>
+        <w:gridCol w:w="9360"/>
+      </w:tblGrid>
+      <w:tr>
+        <w:tc>
+          <w:tcPr>
+            <w:tcW w:type="dxa" w:w="9360"/>
+            <w:tcBorders>
+              <w:top w:val="single" w:color="D69E2E" w:sz="4"/>
+              <w:left w:val="single" w:color="D69E2E" w:sz="14"/>
+              <w:bottom w:val="single" w:color="D69E2E" w:sz="4"/>
+              <w:right w:val="single" w:color="D69E2E" w:sz="4"/>
+            </w:tcBorders>
+            <w:shd w:fill="FFFBEB" w:val="clear"/>
+            <w:tcMar>
+              <w:top w:type="dxa" w:w="120"/>
+              <w:left w:type="dxa" w:w="200"/>
+              <w:bottom w:type="dxa" w:w="120"/>
+              <w:right w:type="dxa" w:w="200"/>
+            </w:tcMar>
+          </w:tcPr>
+          <w:p>
+            <w:pPr>
+              <w:spacing w:after="60"/>
+            </w:pPr>
+            <w:r>
+              <w:rPr>
+                <w:rFonts w:ascii="Arial" w:cs="Arial" w:eastAsia="Arial" w:hAnsi="Arial"/>
+                <w:color w:val="1A365D"/>
+                <w:sz w:val="20"/>
+                <w:szCs w:val="20"/>
+              </w:rPr>
+              <w:t xml:space="preserve">Why the average train loss (0.72) is higher than the final step loss (0.58):</w:t>
+            </w:r>
+          </w:p>
+          <w:p>
+            <w:pPr>
+              <w:spacing w:after="60"/>
+            </w:pPr>
+            <w:r>
+              <w:rPr>
+                <w:rFonts w:ascii="Arial" w:cs="Arial" w:eastAsia="Arial" w:hAnsi="Arial"/>
+                <w:color w:val="1A365D"/>
+                <w:sz w:val="20"/>
+                <w:szCs w:val="20"/>
+              </w:rPr>
+              <w:t xml:space="preserve">The average is computed over all 3,492 steps including early high-loss steps.</w:t>
+            </w:r>
+          </w:p>
+          <w:p>
+            <w:pPr>
+              <w:spacing w:after="60"/>
+            </w:pPr>
+            <w:r>
+              <w:rPr>
+                <w:rFonts w:ascii="Arial" w:cs="Arial" w:eastAsia="Arial" w:hAnsi="Arial"/>
+                <w:color w:val="1A365D"/>
+                <w:sz w:val="20"/>
+                <w:szCs w:val="20"/>
+              </w:rPr>
+              <w:t xml:space="preserve">The final step loss (0.58) is just the last batch. Eval loss (0.71) is the</w:t>
+            </w:r>
+          </w:p>
+          <w:p>
+            <w:pPr>
+              <w:spacing w:after="60"/>
+            </w:pPr>
+            <w:r>
+              <w:rPr>
+                <w:rFonts w:ascii="Arial" w:cs="Arial" w:eastAsia="Arial" w:hAnsi="Arial"/>
+                <w:color w:val="1A365D"/>
+                <w:sz w:val="20"/>
+                <w:szCs w:val="20"/>
+              </w:rPr>
+              <w:t xml:space="preserve">correct measure of generalisation — computed on held-out data all at once.</w:t>
+            </w:r>
+          </w:p>
+        </w:tc>
+      </w:tr>
+    </w:tbl>
+    <w:p>
+      <w:pPr>
+        <w:spacing w:after="100"/>
+      </w:pPr>
+      <w:r>
+        <w:t xml:space="preserve"/>
+      </w:r>
+    </w:p>
+    <w:p>
+      <w:pPr>
+        <w:pStyle w:val="Heading2"/>
+      </w:pPr>
+      <w:r>
+        <w:t xml:space="preserve">8e. Running the qualitative comparison yourself</w:t>
+      </w:r>
+    </w:p>
+    <w:p>
+      <w:pPr>
+        <w:spacing w:before="0" w:after="160"/>
+      </w:pPr>
+      <w:r>
+        <w:rPr>
+          <w:rFonts w:ascii="Arial" w:cs="Arial" w:eastAsia="Arial" w:hAnsi="Arial"/>
+          <w:color w:val="1A202C"/>
+          <w:sz w:val="22"/>
+          <w:szCs w:val="22"/>
+        </w:rPr>
+        <w:t xml:space="preserve">eval.py supports a --compare-base flag that loads both the base model and the fine-tuned adapter, runs the same cybersecurity prompts through each, and prints side-by-side responses. This is the fastest way to see the effect of fine-tuning with your own eyes.</w:t>
+      </w:r>
+    </w:p>
+    <w:tbl>
+      <w:tblPr>
+        <w:tblW w:type="dxa" w:w="9360"/>
+        <w:tblBorders>
+          <w:top w:val="single" w:color="auto" w:sz="4"/>
+          <w:left w:val="single" w:color="auto" w:sz="4"/>
+          <w:bottom w:val="single" w:color="auto" w:sz="4"/>
+          <w:right w:val="single" w:color="auto" w:sz="4"/>
+          <w:insideH w:val="single" w:color="auto" w:sz="4"/>
+          <w:insideV w:val="single" w:color="auto" w:sz="4"/>
+        </w:tblBorders>
+      </w:tblPr>
+      <w:tblGrid>
+        <w:gridCol w:w="9360"/>
+      </w:tblGrid>
+      <w:tr>
+        <w:tc>
+          <w:tcPr>
+            <w:tcW w:type="dxa" w:w="9360"/>
+            <w:tcBorders>
+              <w:top w:val="single" w:color="CCCCCC" w:sz="1"/>
+              <w:left w:val="single" w:color="CCCCCC" w:sz="1"/>
+              <w:bottom w:val="single" w:color="CCCCCC" w:sz="1"/>
+              <w:right w:val="single" w:color="CCCCCC" w:sz="1"/>
+            </w:tcBorders>
+            <w:shd w:fill="F0F4F8" w:val="clear"/>
+            <w:tcMar>
+              <w:top w:type="dxa" w:w="120"/>
+              <w:left w:type="dxa" w:w="200"/>
+              <w:bottom w:type="dxa" w:w="120"/>
+              <w:right w:type="dxa" w:w="200"/>
+            </w:tcMar>
+          </w:tcPr>
+          <w:p>
+            <w:pPr>
+              <w:spacing w:line="260"/>
+            </w:pPr>
+            <w:r>
+              <w:rPr>
+                <w:rFonts w:ascii="Courier New" w:cs="Courier New" w:eastAsia="Courier New" w:hAnsi="Courier New"/>
+                <w:color w:val="2D3748"/>
+                <w:sz w:val="18"/>
+                <w:szCs w:val="18"/>
+              </w:rPr>
+              <w:t xml:space="preserve"># Run from the LoraForge project directory on Lambda Cloud (A10G/A100):</w:t>
+            </w:r>
+          </w:p>
+          <w:p>
+            <w:pPr>
+              <w:spacing w:line="260"/>
+            </w:pPr>
+            <w:r>
+              <w:rPr>
+                <w:rFonts w:ascii="Courier New" w:cs="Courier New" w:eastAsia="Courier New" w:hAnsi="Courier New"/>
+                <w:color w:val="2D3748"/>
+                <w:sz w:val="18"/>
+                <w:szCs w:val="18"/>
+              </w:rPr>
+              <w:t xml:space="preserve"/>
+            </w:r>
+          </w:p>
+          <w:p>
+            <w:pPr>
+              <w:spacing w:line="260"/>
+            </w:pPr>
+            <w:r>
+              <w:rPr>
+                <w:rFonts w:ascii="Courier New" w:cs="Courier New" w:eastAsia="Courier New" w:hAnsi="Courier New"/>
+                <w:color w:val="2D3748"/>
+                <w:sz w:val="18"/>
+                <w:szCs w:val="18"/>
+              </w:rPr>
+              <w:t xml:space="preserve"># Just the fine-tuned adapter (fast, ~8GB VRAM, works on Mac with 16GB RAM):</w:t>
+            </w:r>
+          </w:p>
+          <w:p>
+            <w:pPr>
+              <w:spacing w:line="260"/>
+            </w:pPr>
+            <w:r>
+              <w:rPr>
+                <w:rFonts w:ascii="Courier New" w:cs="Courier New" w:eastAsia="Courier New" w:hAnsi="Courier New"/>
+                <w:color w:val="2D3748"/>
+                <w:sz w:val="18"/>
+                <w:szCs w:val="18"/>
+              </w:rPr>
+              <w:t xml:space="preserve">python -m activity0_sft.evaluation.eval \</w:t>
+            </w:r>
+          </w:p>
+          <w:p>
+            <w:pPr>
+              <w:spacing w:line="260"/>
+            </w:pPr>
+            <w:r>
+              <w:rPr>
+                <w:rFonts w:ascii="Courier New" w:cs="Courier New" w:eastAsia="Courier New" w:hAnsi="Courier New"/>
+                <w:color w:val="2D3748"/>
+                <w:sz w:val="18"/>
+                <w:szCs w:val="18"/>
+              </w:rPr>
+              <w:t xml:space="preserve">    --adapter-path ./outputs/cybersec_analyst_lora</w:t>
+            </w:r>
+          </w:p>
+          <w:p>
+            <w:pPr>
+              <w:spacing w:line="260"/>
+            </w:pPr>
+            <w:r>
+              <w:rPr>
+                <w:rFonts w:ascii="Courier New" w:cs="Courier New" w:eastAsia="Courier New" w:hAnsi="Courier New"/>
+                <w:color w:val="2D3748"/>
+                <w:sz w:val="18"/>
+                <w:szCs w:val="18"/>
+              </w:rPr>
+              <w:t xml:space="preserve"/>
+            </w:r>
+          </w:p>
+          <w:p>
+            <w:pPr>
+              <w:spacing w:line="260"/>
+            </w:pPr>
+            <w:r>
+              <w:rPr>
+                <w:rFonts w:ascii="Courier New" w:cs="Courier New" w:eastAsia="Courier New" w:hAnsi="Courier New"/>
+                <w:color w:val="2D3748"/>
+                <w:sz w:val="18"/>
+                <w:szCs w:val="18"/>
+              </w:rPr>
+              <w:t xml:space="preserve"># Side-by-side: base model vs fine-tuned (~16GB VRAM, needs Lambda GPU):</w:t>
+            </w:r>
+          </w:p>
+          <w:p>
+            <w:pPr>
+              <w:spacing w:line="260"/>
+            </w:pPr>
+            <w:r>
+              <w:rPr>
+                <w:rFonts w:ascii="Courier New" w:cs="Courier New" w:eastAsia="Courier New" w:hAnsi="Courier New"/>
+                <w:color w:val="2D3748"/>
+                <w:sz w:val="18"/>
+                <w:szCs w:val="18"/>
+              </w:rPr>
+              <w:t xml:space="preserve">python -m activity0_sft.evaluation.eval \</w:t>
+            </w:r>
+          </w:p>
+          <w:p>
+            <w:pPr>
+              <w:spacing w:line="260"/>
+            </w:pPr>
+            <w:r>
+              <w:rPr>
+                <w:rFonts w:ascii="Courier New" w:cs="Courier New" w:eastAsia="Courier New" w:hAnsi="Courier New"/>
+                <w:color w:val="2D3748"/>
+                <w:sz w:val="18"/>
+                <w:szCs w:val="18"/>
+              </w:rPr>
+              <w:t xml:space="preserve">    --adapter-path ./outputs/cybersec_analyst_lora \</w:t>
+            </w:r>
+          </w:p>
+          <w:p>
+            <w:pPr>
+              <w:spacing w:line="260"/>
+            </w:pPr>
+            <w:r>
+              <w:rPr>
+                <w:rFonts w:ascii="Courier New" w:cs="Courier New" w:eastAsia="Courier New" w:hAnsi="Courier New"/>
+                <w:color w:val="2D3748"/>
+                <w:sz w:val="18"/>
+                <w:szCs w:val="18"/>
+              </w:rPr>
+              <w:t xml:space="preserve">    --compare-base</w:t>
+            </w:r>
+          </w:p>
+          <w:p>
+            <w:pPr>
+              <w:spacing w:line="260"/>
+            </w:pPr>
+            <w:r>
+              <w:rPr>
+                <w:rFonts w:ascii="Courier New" w:cs="Courier New" w:eastAsia="Courier New" w:hAnsi="Courier New"/>
+                <w:color w:val="2D3748"/>
+                <w:sz w:val="18"/>
+                <w:szCs w:val="18"/>
+              </w:rPr>
+              <w:t xml:space="preserve"/>
+            </w:r>
+          </w:p>
+          <w:p>
+            <w:pPr>
+              <w:spacing w:line="260"/>
+            </w:pPr>
+            <w:r>
+              <w:rPr>
+                <w:rFonts w:ascii="Courier New" w:cs="Courier New" w:eastAsia="Courier New" w:hAnsi="Courier New"/>
+                <w:color w:val="2D3748"/>
+                <w:sz w:val="18"/>
+                <w:szCs w:val="18"/>
+              </w:rPr>
+              <w:t xml:space="preserve"># What the output shows:</w:t>
+            </w:r>
+          </w:p>
+          <w:p>
+            <w:pPr>
+              <w:spacing w:line="260"/>
+            </w:pPr>
+            <w:r>
+              <w:rPr>
+                <w:rFonts w:ascii="Courier New" w:cs="Courier New" w:eastAsia="Courier New" w:hAnsi="Courier New"/>
+                <w:color w:val="2D3748"/>
+                <w:sz w:val="18"/>
+                <w:szCs w:val="18"/>
+              </w:rPr>
+              <w:t xml:space="preserve">#   [BASE MODEL]   "What is CVE-2021-44228?" → generic, surface-level answer</w:t>
+            </w:r>
+          </w:p>
+          <w:p>
+            <w:pPr>
+              <w:spacing w:line="260"/>
+            </w:pPr>
+            <w:r>
+              <w:rPr>
+                <w:rFonts w:ascii="Courier New" w:cs="Courier New" w:eastAsia="Courier New" w:hAnsi="Courier New"/>
+                <w:color w:val="2D3748"/>
+                <w:sz w:val="18"/>
+                <w:szCs w:val="18"/>
+              </w:rPr>
+              <w:t xml:space="preserve">#   [FINE-TUNED]   "What is CVE-2021-44228?" → precise, structured, domain-aware answer</w:t>
+            </w:r>
+          </w:p>
+          <w:p>
+            <w:pPr>
+              <w:spacing w:line="260"/>
+            </w:pPr>
+            <w:r>
+              <w:rPr>
+                <w:rFonts w:ascii="Courier New" w:cs="Courier New" w:eastAsia="Courier New" w:hAnsi="Courier New"/>
+                <w:color w:val="2D3748"/>
+                <w:sz w:val="18"/>
+                <w:szCs w:val="18"/>
+              </w:rPr>
+              <w:t xml:space="preserve"/>
+            </w:r>
+          </w:p>
+          <w:p>
+            <w:pPr>
+              <w:spacing w:line="260"/>
+            </w:pPr>
+            <w:r>
+              <w:rPr>
+                <w:rFonts w:ascii="Courier New" w:cs="Courier New" w:eastAsia="Courier New" w:hAnsi="Courier New"/>
+                <w:color w:val="2D3748"/>
+                <w:sz w:val="18"/>
+                <w:szCs w:val="18"/>
+              </w:rPr>
+              <w:t xml:space="preserve"># Note: On Mac, --compare-base may OOM if you have less than 16GB unified memory.</w:t>
+            </w:r>
+          </w:p>
+          <w:p>
+            <w:pPr>
+              <w:spacing w:line="260"/>
+            </w:pPr>
+            <w:r>
+              <w:rPr>
+                <w:rFonts w:ascii="Courier New" w:cs="Courier New" w:eastAsia="Courier New" w:hAnsi="Courier New"/>
+                <w:color w:val="2D3748"/>
+                <w:sz w:val="18"/>
+                <w:szCs w:val="18"/>
+              </w:rPr>
+              <w:t xml:space="preserve"># If it does, run on Lambda A10G — you will do this naturally in Activity 1 setup.</w:t>
+            </w:r>
+          </w:p>
+        </w:tc>
+      </w:tr>
+    </w:tbl>
+    <w:p>
+      <w:pPr>
+        <w:spacing w:after="100"/>
+      </w:pPr>
+      <w:r>
+        <w:t xml:space="preserve"/>
+      </w:r>
+    </w:p>
+    <w:p>
+      <w:pPr>
+        <w:pStyle w:val="Heading2"/>
+      </w:pPr>
+      <w:r>
+        <w:t xml:space="preserve">8f. The three evaluation signals and what each tells you</w:t>
+      </w:r>
+    </w:p>
+    <w:tbl>
+      <w:tblPr>
+        <w:tblW w:type="dxa" w:w="9360"/>
+        <w:tblBorders>
+          <w:top w:val="single" w:color="auto" w:sz="4"/>
+          <w:left w:val="single" w:color="auto" w:sz="4"/>
+          <w:bottom w:val="single" w:color="auto" w:sz="4"/>
+          <w:right w:val="single" w:color="auto" w:sz="4"/>
+          <w:insideH w:val="single" w:color="auto" w:sz="4"/>
+          <w:insideV w:val="single" w:color="auto" w:sz="4"/>
+        </w:tblBorders>
+      </w:tblPr>
+      <w:tblGrid>
+        <w:gridCol w:w="9360"/>
+      </w:tblGrid>
+      <w:tr>
+        <w:tc>
+          <w:tcPr>
+            <w:tcW w:type="dxa" w:w="9360"/>
+            <w:tcBorders>
+              <w:top w:val="single" w:color="CCCCCC" w:sz="1"/>
+              <w:left w:val="single" w:color="CCCCCC" w:sz="1"/>
+              <w:bottom w:val="single" w:color="CCCCCC" w:sz="1"/>
+              <w:right w:val="single" w:color="CCCCCC" w:sz="1"/>
+            </w:tcBorders>
+            <w:shd w:fill="F0F4F8" w:val="clear"/>
+            <w:tcMar>
+              <w:top w:type="dxa" w:w="120"/>
+              <w:left w:type="dxa" w:w="200"/>
+              <w:bottom w:type="dxa" w:w="120"/>
+              <w:right w:type="dxa" w:w="200"/>
+            </w:tcMar>
+          </w:tcPr>
+          <w:p>
+            <w:pPr>
+              <w:spacing w:line="260"/>
+            </w:pPr>
+            <w:r>
+              <w:rPr>
+                <w:rFonts w:ascii="Courier New" w:cs="Courier New" w:eastAsia="Courier New" w:hAnsi="Courier New"/>
+                <w:color w:val="2D3748"/>
+                <w:sz w:val="18"/>
+                <w:szCs w:val="18"/>
+              </w:rPr>
+              <w:t xml:space="preserve">SIGNAL 1: Training loss curve</w:t>
+            </w:r>
+          </w:p>
+          <w:p>
+            <w:pPr>
+              <w:spacing w:line="260"/>
+            </w:pPr>
+            <w:r>
+              <w:rPr>
+                <w:rFonts w:ascii="Courier New" w:cs="Courier New" w:eastAsia="Courier New" w:hAnsi="Courier New"/>
+                <w:color w:val="2D3748"/>
+                <w:sz w:val="18"/>
+                <w:szCs w:val="18"/>
+              </w:rPr>
+              <w:t xml:space="preserve">  What it shows: is the model learning at all?</w:t>
+            </w:r>
+          </w:p>
+          <w:p>
+            <w:pPr>
+              <w:spacing w:line="260"/>
+            </w:pPr>
+            <w:r>
+              <w:rPr>
+                <w:rFonts w:ascii="Courier New" w:cs="Courier New" w:eastAsia="Courier New" w:hAnsi="Courier New"/>
+                <w:color w:val="2D3748"/>
+                <w:sz w:val="18"/>
+                <w:szCs w:val="18"/>
+              </w:rPr>
+              <w:t xml:space="preserve">  Healthy: smooth decrease from ~2.1 to ~0.6-0.8 over 3 epochs</w:t>
+            </w:r>
+          </w:p>
+          <w:p>
+            <w:pPr>
+              <w:spacing w:line="260"/>
+            </w:pPr>
+            <w:r>
+              <w:rPr>
+                <w:rFonts w:ascii="Courier New" w:cs="Courier New" w:eastAsia="Courier New" w:hAnsi="Courier New"/>
+                <w:color w:val="2D3748"/>
+                <w:sz w:val="18"/>
+                <w:szCs w:val="18"/>
+              </w:rPr>
+              <w:t xml:space="preserve">  Red flag: stuck (lr too low), spiking (lr too high), or flat at zero (data format bug)</w:t>
+            </w:r>
+          </w:p>
+          <w:p>
+            <w:pPr>
+              <w:spacing w:line="260"/>
+            </w:pPr>
+            <w:r>
+              <w:rPr>
+                <w:rFonts w:ascii="Courier New" w:cs="Courier New" w:eastAsia="Courier New" w:hAnsi="Courier New"/>
+                <w:color w:val="2D3748"/>
+                <w:sz w:val="18"/>
+                <w:szCs w:val="18"/>
+              </w:rPr>
+              <w:t xml:space="preserve"/>
+            </w:r>
+          </w:p>
+          <w:p>
+            <w:pPr>
+              <w:spacing w:line="260"/>
+            </w:pPr>
+            <w:r>
+              <w:rPr>
+                <w:rFonts w:ascii="Courier New" w:cs="Courier New" w:eastAsia="Courier New" w:hAnsi="Courier New"/>
+                <w:color w:val="2D3748"/>
+                <w:sz w:val="18"/>
+                <w:szCs w:val="18"/>
+              </w:rPr>
+              <w:t xml:space="preserve">SIGNAL 2: Eval loss / perplexity</w:t>
+            </w:r>
+          </w:p>
+          <w:p>
+            <w:pPr>
+              <w:spacing w:line="260"/>
+            </w:pPr>
+            <w:r>
+              <w:rPr>
+                <w:rFonts w:ascii="Courier New" w:cs="Courier New" w:eastAsia="Courier New" w:hAnsi="Courier New"/>
+                <w:color w:val="2D3748"/>
+                <w:sz w:val="18"/>
+                <w:szCs w:val="18"/>
+              </w:rPr>
+              <w:t xml:space="preserve">  What it shows: does the learning generalise to unseen examples?</w:t>
+            </w:r>
+          </w:p>
+          <w:p>
+            <w:pPr>
+              <w:spacing w:line="260"/>
+            </w:pPr>
+            <w:r>
+              <w:rPr>
+                <w:rFonts w:ascii="Courier New" w:cs="Courier New" w:eastAsia="Courier New" w:hAnsi="Courier New"/>
+                <w:color w:val="2D3748"/>
+                <w:sz w:val="18"/>
+                <w:szCs w:val="18"/>
+              </w:rPr>
+              <w:t xml:space="preserve">  Healthy: eval_loss tracks train_loss closely (gap &lt; 0.05)</w:t>
+            </w:r>
+          </w:p>
+          <w:p>
+            <w:pPr>
+              <w:spacing w:line="260"/>
+            </w:pPr>
+            <w:r>
+              <w:rPr>
+                <w:rFonts w:ascii="Courier New" w:cs="Courier New" w:eastAsia="Courier New" w:hAnsi="Courier New"/>
+                <w:color w:val="2D3748"/>
+                <w:sz w:val="18"/>
+                <w:szCs w:val="18"/>
+              </w:rPr>
+              <w:t xml:space="preserve">  Red flag: eval_loss rises while train_loss drops (overfitting)</w:t>
+            </w:r>
+          </w:p>
+          <w:p>
+            <w:pPr>
+              <w:spacing w:line="260"/>
+            </w:pPr>
+            <w:r>
+              <w:rPr>
+                <w:rFonts w:ascii="Courier New" w:cs="Courier New" w:eastAsia="Courier New" w:hAnsi="Courier New"/>
+                <w:color w:val="2D3748"/>
+                <w:sz w:val="18"/>
+                <w:szCs w:val="18"/>
+              </w:rPr>
+              <w:t xml:space="preserve">  Activity 0 result: 0.7126 / 2.04 (down from 5.22 baseline = 61% reduction)</w:t>
+            </w:r>
+          </w:p>
+          <w:p>
+            <w:pPr>
+              <w:spacing w:line="260"/>
+            </w:pPr>
+            <w:r>
+              <w:rPr>
+                <w:rFonts w:ascii="Courier New" w:cs="Courier New" w:eastAsia="Courier New" w:hAnsi="Courier New"/>
+                <w:color w:val="2D3748"/>
+                <w:sz w:val="18"/>
+                <w:szCs w:val="18"/>
+              </w:rPr>
+              <w:t xml:space="preserve"/>
+            </w:r>
+          </w:p>
+          <w:p>
+            <w:pPr>
+              <w:spacing w:line="260"/>
+            </w:pPr>
+            <w:r>
+              <w:rPr>
+                <w:rFonts w:ascii="Courier New" w:cs="Courier New" w:eastAsia="Courier New" w:hAnsi="Courier New"/>
+                <w:color w:val="2D3748"/>
+                <w:sz w:val="18"/>
+                <w:szCs w:val="18"/>
+              </w:rPr>
+              <w:t xml:space="preserve">SIGNAL 3: Qualitative response quality</w:t>
+            </w:r>
+          </w:p>
+          <w:p>
+            <w:pPr>
+              <w:spacing w:line="260"/>
+            </w:pPr>
+            <w:r>
+              <w:rPr>
+                <w:rFonts w:ascii="Courier New" w:cs="Courier New" w:eastAsia="Courier New" w:hAnsi="Courier New"/>
+                <w:color w:val="2D3748"/>
+                <w:sz w:val="18"/>
+                <w:szCs w:val="18"/>
+              </w:rPr>
+              <w:t xml:space="preserve">  What it shows: is the output actually useful to a human?</w:t>
+            </w:r>
+          </w:p>
+          <w:p>
+            <w:pPr>
+              <w:spacing w:line="260"/>
+            </w:pPr>
+            <w:r>
+              <w:rPr>
+                <w:rFonts w:ascii="Courier New" w:cs="Courier New" w:eastAsia="Courier New" w:hAnsi="Courier New"/>
+                <w:color w:val="2D3748"/>
+                <w:sz w:val="18"/>
+                <w:szCs w:val="18"/>
+              </w:rPr>
+              <w:t xml:space="preserve">  Healthy: more structured, precise, domain-accurate responses vs base model</w:t>
+            </w:r>
+          </w:p>
+          <w:p>
+            <w:pPr>
+              <w:spacing w:line="260"/>
+            </w:pPr>
+            <w:r>
+              <w:rPr>
+                <w:rFonts w:ascii="Courier New" w:cs="Courier New" w:eastAsia="Courier New" w:hAnsi="Courier New"/>
+                <w:color w:val="2D3748"/>
+                <w:sz w:val="18"/>
+                <w:szCs w:val="18"/>
+              </w:rPr>
+              <w:t xml:space="preserve">  Red flag: model is technically lower-perplexity but gives stilted/wrong answers</w:t>
+            </w:r>
+          </w:p>
+          <w:p>
+            <w:pPr>
+              <w:spacing w:line="260"/>
+            </w:pPr>
+            <w:r>
+              <w:rPr>
+                <w:rFonts w:ascii="Courier New" w:cs="Courier New" w:eastAsia="Courier New" w:hAnsi="Courier New"/>
+                <w:color w:val="2D3748"/>
+                <w:sz w:val="18"/>
+                <w:szCs w:val="18"/>
+              </w:rPr>
+              <w:t xml:space="preserve">  (This can happen if the training data has quality issues)</w:t>
             </w:r>
           </w:p>
         </w:tc>
@@ -4608,7 +6027,7 @@
         <w:sz w:val="18"/>
         <w:szCs w:val="18"/>
       </w:rPr>
-      <w:t xml:space="preserve">		CONCEPT 03: SFT TRAINING OBJECTIVE</w:t>
+      <w:t xml:space="preserve">		CONCEPT 00 — PART 3: SFT TRAINING OBJECTIVE</w:t>
     </w:r>
   </w:p>
 </w:hdr>

</xml_diff>